<commit_message>
docs: restructure example.qmd with Chinese numbering (一、（一）、1.), add mock attachments
- Use 一、 (一) 1. patterns instead of markdown #/##/### to
  exercise title-promotion.lua filter
- Add two mock attachments (附件)
- Add title-promotion.lua to ConTeXt filter chain
- Update rendered example outputs

Co-Authored-By: Claude <noreply@anthropic.com>
</commit_message>
<xml_diff>
--- a/example.docx
+++ b/example.docx
@@ -33,7 +33,6 @@
         <w:t xml:space="preserve">9704—2012《党政机关公文格式》国家标准，特编制本示例文档。请各级单位认真组织学习，确保正确执行公文格式规范。</w:t>
       </w:r>
     </w:p>
-    <w:bookmarkStart w:id="18" w:name="正文格式"/>
     <w:p>
       <w:pPr>
         <w:pStyle w:val="Heading1"/>
@@ -42,7 +41,7 @@
         <w:rPr>
           <w:rFonts w:hint="eastAsia"/>
         </w:rPr>
-        <w:t xml:space="preserve">正文格式</w:t>
+        <w:t xml:space="preserve">一、正文格式</w:t>
       </w:r>
     </w:p>
     <w:p>
@@ -115,17 +114,15 @@
         <w:t xml:space="preserve">公文处理工作应当坚持实事求是、准确规范、精简高效、安全保密的原则。公文格式是公文质量的重要体现，各级机关必须严格遵守国家标准，不得自行其是。</w:t>
       </w:r>
     </w:p>
-    <w:bookmarkEnd w:id="18"/>
-    <w:bookmarkStart w:id="20" w:name="二级标题格式"/>
     <w:p>
       <w:pPr>
-        <w:pStyle w:val="Heading1"/>
-      </w:pPr>
-      <w:r>
-        <w:rPr>
-          <w:rFonts w:hint="eastAsia"/>
-        </w:rPr>
-        <w:t xml:space="preserve">二级标题格式</w:t>
+        <w:pStyle w:val="Heading2"/>
+      </w:pPr>
+      <w:r>
+        <w:rPr>
+          <w:rFonts w:hint="eastAsia"/>
+        </w:rPr>
+        <w:t xml:space="preserve">（一）二级标题格式</w:t>
       </w:r>
     </w:p>
     <w:p>
@@ -172,10 +169,13 @@
         <w:t xml:space="preserve">标注。二级标题一般用三号楷体字。</w:t>
       </w:r>
     </w:p>
-    <w:bookmarkStart w:id="19" w:name="三级标题格式"/>
     <w:p>
       <w:pPr>
-        <w:pStyle w:val="Heading2"/>
+        <w:pStyle w:val="Compact"/>
+        <w:numPr>
+          <w:ilvl w:val="0"/>
+          <w:numId w:val="1001"/>
+        </w:numPr>
       </w:pPr>
       <w:r>
         <w:rPr>
@@ -204,9 +204,6 @@
         <w:t xml:space="preserve">字符。</w:t>
       </w:r>
     </w:p>
-    <w:bookmarkEnd w:id="19"/>
-    <w:bookmarkEnd w:id="20"/>
-    <w:bookmarkStart w:id="21" w:name="表格示例"/>
     <w:p>
       <w:pPr>
         <w:pStyle w:val="Heading1"/>
@@ -215,7 +212,7 @@
         <w:rPr>
           <w:rFonts w:hint="eastAsia"/>
         </w:rPr>
-        <w:t xml:space="preserve">表格示例</w:t>
+        <w:t xml:space="preserve">一、表格示例</w:t>
       </w:r>
     </w:p>
     <w:p>
@@ -459,8 +456,6 @@
         </w:tc>
       </w:tr>
     </w:tbl>
-    <w:bookmarkEnd w:id="21"/>
-    <w:bookmarkStart w:id="22" w:name="附件示例"/>
     <w:p>
       <w:pPr>
         <w:pStyle w:val="Heading1"/>
@@ -469,7 +464,7 @@
         <w:rPr>
           <w:rFonts w:hint="eastAsia"/>
         </w:rPr>
-        <w:t xml:space="preserve">附件示例</w:t>
+        <w:t xml:space="preserve">一、附件</w:t>
       </w:r>
     </w:p>
     <w:p>
@@ -483,31 +478,40 @@
         <w:t xml:space="preserve">附件是公文正文的补充说明材料，是公文的重要组成部分。附件应当另页编排，并在版记之前、成文日期之后标注。</w:t>
       </w:r>
     </w:p>
-    <w:bookmarkEnd w:id="22"/>
-    <w:bookmarkStart w:id="23" w:name="公文要素"/>
     <w:p>
       <w:pPr>
-        <w:pStyle w:val="Heading1"/>
-      </w:pPr>
-      <w:r>
-        <w:rPr>
-          <w:rFonts w:hint="eastAsia"/>
-        </w:rPr>
-        <w:t xml:space="preserve">公文要素</w:t>
+        <w:pStyle w:val="BodyText"/>
+      </w:pPr>
+      <w:r>
+        <w:rPr>
+          <w:rFonts w:hint="eastAsia"/>
+        </w:rPr>
+        <w:t xml:space="preserve">附件：1.</w:t>
+      </w:r>
+      <w:r>
+        <w:t xml:space="preserve"> </w:t>
+      </w:r>
+      <w:r>
+        <w:rPr>
+          <w:rFonts w:hint="eastAsia"/>
+        </w:rPr>
+        <w:t xml:space="preserve">关于印发《公文处理办法》的通知</w:t>
       </w:r>
     </w:p>
     <w:p>
       <w:pPr>
-        <w:pStyle w:val="FirstParagraph"/>
-      </w:pPr>
-      <w:r>
-        <w:rPr>
-          <w:rFonts w:hint="eastAsia"/>
-        </w:rPr>
-        <w:t xml:space="preserve">公文一般由份号、密级和保密期限、紧急程度、发文机关标志、发文字号、签发人、标题、主送机关、正文、附件说明、发文机关署名、成文日期、印章、附注、附件、抄送机关、印发机关和印发日期、页码等要素组成。</w:t>
+        <w:pStyle w:val="BodyText"/>
+      </w:pPr>
+      <w:r>
+        <w:t xml:space="preserve">　　2. </w:t>
+      </w:r>
+      <w:r>
+        <w:rPr>
+          <w:rFonts w:hint="eastAsia"/>
+        </w:rPr>
+        <w:t xml:space="preserve">公文格式标准对照表</w:t>
       </w:r>
     </w:p>
-    <w:bookmarkEnd w:id="23"/>
     <w:sectPr>
       <w:footerReference r:id="rId9" w:type="default"/>
       <w:pgSz w:h="16838" w:w="11906"/>
@@ -650,8 +654,123 @@
       </w:pPr>
     </w:lvl>
   </w:abstractNum>
+  <w:abstractNum w:abstractNumId="99411">
+    <w:nsid w:val="00A99411"/>
+    <w:multiLevelType w:val="multilevel"/>
+    <w:lvl w:ilvl="0">
+      <w:start w:val="1"/>
+      <w:numFmt w:val="decimal"/>
+      <w:lvlText w:val="%1."/>
+      <w:lvlJc w:val="left"/>
+      <w:pPr>
+        <w:ind w:left="720" w:hanging="360"/>
+      </w:pPr>
+    </w:lvl>
+    <w:lvl w:ilvl="1">
+      <w:start w:val="1"/>
+      <w:numFmt w:val="decimal"/>
+      <w:lvlText w:val="%2."/>
+      <w:lvlJc w:val="left"/>
+      <w:pPr>
+        <w:ind w:left="1440" w:hanging="360"/>
+      </w:pPr>
+    </w:lvl>
+    <w:lvl w:ilvl="2">
+      <w:start w:val="1"/>
+      <w:numFmt w:val="decimal"/>
+      <w:lvlText w:val="%3."/>
+      <w:lvlJc w:val="left"/>
+      <w:pPr>
+        <w:ind w:left="2160" w:hanging="360"/>
+      </w:pPr>
+    </w:lvl>
+    <w:lvl w:ilvl="3">
+      <w:start w:val="1"/>
+      <w:numFmt w:val="decimal"/>
+      <w:lvlText w:val="%4."/>
+      <w:lvlJc w:val="left"/>
+      <w:pPr>
+        <w:ind w:left="2880" w:hanging="360"/>
+      </w:pPr>
+    </w:lvl>
+    <w:lvl w:ilvl="4">
+      <w:start w:val="1"/>
+      <w:numFmt w:val="decimal"/>
+      <w:lvlText w:val="%5."/>
+      <w:lvlJc w:val="left"/>
+      <w:pPr>
+        <w:ind w:left="3600" w:hanging="360"/>
+      </w:pPr>
+    </w:lvl>
+    <w:lvl w:ilvl="5">
+      <w:start w:val="1"/>
+      <w:numFmt w:val="decimal"/>
+      <w:lvlText w:val="%6."/>
+      <w:lvlJc w:val="left"/>
+      <w:pPr>
+        <w:ind w:left="4320" w:hanging="360"/>
+      </w:pPr>
+    </w:lvl>
+    <w:lvl w:ilvl="6">
+      <w:start w:val="1"/>
+      <w:numFmt w:val="decimal"/>
+      <w:lvlText w:val="%7."/>
+      <w:lvlJc w:val="left"/>
+      <w:pPr>
+        <w:ind w:left="5040" w:hanging="360"/>
+      </w:pPr>
+    </w:lvl>
+    <w:lvl w:ilvl="7">
+      <w:start w:val="1"/>
+      <w:numFmt w:val="decimal"/>
+      <w:lvlText w:val="%8."/>
+      <w:lvlJc w:val="left"/>
+      <w:pPr>
+        <w:ind w:left="5760" w:hanging="360"/>
+      </w:pPr>
+    </w:lvl>
+    <w:lvl w:ilvl="8">
+      <w:start w:val="1"/>
+      <w:numFmt w:val="decimal"/>
+      <w:lvlText w:val="%9."/>
+      <w:lvlJc w:val="left"/>
+      <w:pPr>
+        <w:ind w:left="6480" w:hanging="360"/>
+      </w:pPr>
+    </w:lvl>
+  </w:abstractNum>
   <w:num w:numId="1000">
     <w:abstractNumId w:val="990"/>
+  </w:num>
+  <w:num w:numId="1001">
+    <w:abstractNumId w:val="99411"/>
+    <w:lvlOverride w:ilvl="0">
+      <w:startOverride w:val="1"/>
+    </w:lvlOverride>
+    <w:lvlOverride w:ilvl="1">
+      <w:startOverride w:val="1"/>
+    </w:lvlOverride>
+    <w:lvlOverride w:ilvl="2">
+      <w:startOverride w:val="1"/>
+    </w:lvlOverride>
+    <w:lvlOverride w:ilvl="3">
+      <w:startOverride w:val="1"/>
+    </w:lvlOverride>
+    <w:lvlOverride w:ilvl="4">
+      <w:startOverride w:val="1"/>
+    </w:lvlOverride>
+    <w:lvlOverride w:ilvl="5">
+      <w:startOverride w:val="1"/>
+    </w:lvlOverride>
+    <w:lvlOverride w:ilvl="6">
+      <w:startOverride w:val="1"/>
+    </w:lvlOverride>
+    <w:lvlOverride w:ilvl="7">
+      <w:startOverride w:val="1"/>
+    </w:lvlOverride>
+    <w:lvlOverride w:ilvl="8">
+      <w:startOverride w:val="1"/>
+    </w:lvlOverride>
   </w:num>
 </w:numbering>
 </file>

</xml_diff>

<commit_message>
docs: add subtitle, mainreceiver, attachment LaTeX commands to example
</commit_message>
<xml_diff>
--- a/example.docx
+++ b/example.docx
@@ -476,40 +476,6 @@
           <w:rFonts w:hint="eastAsia"/>
         </w:rPr>
         <w:t xml:space="preserve">附件是公文正文的补充说明材料，是公文的重要组成部分。附件应当另页编排，并在版记之前、成文日期之后标注。</w:t>
-      </w:r>
-    </w:p>
-    <w:p>
-      <w:pPr>
-        <w:pStyle w:val="BodyText"/>
-      </w:pPr>
-      <w:r>
-        <w:rPr>
-          <w:rFonts w:hint="eastAsia"/>
-        </w:rPr>
-        <w:t xml:space="preserve">附件：1.</w:t>
-      </w:r>
-      <w:r>
-        <w:t xml:space="preserve"> </w:t>
-      </w:r>
-      <w:r>
-        <w:rPr>
-          <w:rFonts w:hint="eastAsia"/>
-        </w:rPr>
-        <w:t xml:space="preserve">关于印发《公文处理办法》的通知</w:t>
-      </w:r>
-    </w:p>
-    <w:p>
-      <w:pPr>
-        <w:pStyle w:val="BodyText"/>
-      </w:pPr>
-      <w:r>
-        <w:t xml:space="preserve">　　2. </w:t>
-      </w:r>
-      <w:r>
-        <w:rPr>
-          <w:rFonts w:hint="eastAsia"/>
-        </w:rPr>
-        <w:t xml:space="preserve">公文格式标准对照表</w:t>
       </w:r>
     </w:p>
     <w:sectPr>

</xml_diff>

<commit_message>
feat: add gbt9704-metadata.lua filter — map YAML to all cls commands
- gbt9704-metadata.lua injects LaTeX commands from YAML metadata (PDF only):
  \makeheader (红头) -> \gongwentitle (标题) -> \gongwensubtitle (副标题)
  -> \mainreceiver (主送) -> gongwenbody (正文)
  -> attachments (多附件) -> \signature (署名) -> \signdate (日期)
  -> \notes (附注) -> \seprule/\copyto/\issueinfo (版记)
- Fix title ordering: suppress default \maketitle, inject after header
- Use signdate field to avoid Pandoc date parsing conflict
- Add filter to PDF chain in _extension.yml
- Update example.qmd with complete metadata

Co-Authored-By: Claude <noreply@anthropic.com>
</commit_message>
<xml_diff>
--- a/example.docx
+++ b/example.docx
@@ -11,6 +11,17 @@
           <w:rFonts w:hint="eastAsia"/>
         </w:rPr>
         <w:t xml:space="preserve">关于印发《公文格式示例》的通知</w:t>
+      </w:r>
+    </w:p>
+    <w:p>
+      <w:pPr>
+        <w:pStyle w:val="Subtitle"/>
+      </w:pPr>
+      <w:r>
+        <w:rPr>
+          <w:rFonts w:hint="eastAsia"/>
+        </w:rPr>
+        <w:t xml:space="preserve">——关于做好公文格式标准化工作的通知</w:t>
       </w:r>
     </w:p>
     <w:p>

</xml_diff>

<commit_message>
fix: sequential numbering, escape list parsing, add Plain handler
</commit_message>
<xml_diff>
--- a/example.docx
+++ b/example.docx
@@ -182,12 +182,11 @@
     </w:p>
     <w:p>
       <w:pPr>
-        <w:pStyle w:val="Compact"/>
-        <w:numPr>
-          <w:ilvl w:val="0"/>
-          <w:numId w:val="1001"/>
-        </w:numPr>
-      </w:pPr>
+        <w:pStyle w:val="Heading3"/>
+      </w:pPr>
+      <w:r>
+        <w:t xml:space="preserve">1. </w:t>
+      </w:r>
       <w:r>
         <w:rPr>
           <w:rFonts w:hint="eastAsia"/>
@@ -223,7 +222,7 @@
         <w:rPr>
           <w:rFonts w:hint="eastAsia"/>
         </w:rPr>
-        <w:t xml:space="preserve">一、表格示例</w:t>
+        <w:t xml:space="preserve">二、表格示例</w:t>
       </w:r>
     </w:p>
     <w:p>
@@ -475,7 +474,7 @@
         <w:rPr>
           <w:rFonts w:hint="eastAsia"/>
         </w:rPr>
-        <w:t xml:space="preserve">一、附件</w:t>
+        <w:t xml:space="preserve">三、附件</w:t>
       </w:r>
     </w:p>
     <w:p>
@@ -631,123 +630,8 @@
       </w:pPr>
     </w:lvl>
   </w:abstractNum>
-  <w:abstractNum w:abstractNumId="99411">
-    <w:nsid w:val="00A99411"/>
-    <w:multiLevelType w:val="multilevel"/>
-    <w:lvl w:ilvl="0">
-      <w:start w:val="1"/>
-      <w:numFmt w:val="decimal"/>
-      <w:lvlText w:val="%1."/>
-      <w:lvlJc w:val="left"/>
-      <w:pPr>
-        <w:ind w:left="720" w:hanging="360"/>
-      </w:pPr>
-    </w:lvl>
-    <w:lvl w:ilvl="1">
-      <w:start w:val="1"/>
-      <w:numFmt w:val="decimal"/>
-      <w:lvlText w:val="%2."/>
-      <w:lvlJc w:val="left"/>
-      <w:pPr>
-        <w:ind w:left="1440" w:hanging="360"/>
-      </w:pPr>
-    </w:lvl>
-    <w:lvl w:ilvl="2">
-      <w:start w:val="1"/>
-      <w:numFmt w:val="decimal"/>
-      <w:lvlText w:val="%3."/>
-      <w:lvlJc w:val="left"/>
-      <w:pPr>
-        <w:ind w:left="2160" w:hanging="360"/>
-      </w:pPr>
-    </w:lvl>
-    <w:lvl w:ilvl="3">
-      <w:start w:val="1"/>
-      <w:numFmt w:val="decimal"/>
-      <w:lvlText w:val="%4."/>
-      <w:lvlJc w:val="left"/>
-      <w:pPr>
-        <w:ind w:left="2880" w:hanging="360"/>
-      </w:pPr>
-    </w:lvl>
-    <w:lvl w:ilvl="4">
-      <w:start w:val="1"/>
-      <w:numFmt w:val="decimal"/>
-      <w:lvlText w:val="%5."/>
-      <w:lvlJc w:val="left"/>
-      <w:pPr>
-        <w:ind w:left="3600" w:hanging="360"/>
-      </w:pPr>
-    </w:lvl>
-    <w:lvl w:ilvl="5">
-      <w:start w:val="1"/>
-      <w:numFmt w:val="decimal"/>
-      <w:lvlText w:val="%6."/>
-      <w:lvlJc w:val="left"/>
-      <w:pPr>
-        <w:ind w:left="4320" w:hanging="360"/>
-      </w:pPr>
-    </w:lvl>
-    <w:lvl w:ilvl="6">
-      <w:start w:val="1"/>
-      <w:numFmt w:val="decimal"/>
-      <w:lvlText w:val="%7."/>
-      <w:lvlJc w:val="left"/>
-      <w:pPr>
-        <w:ind w:left="5040" w:hanging="360"/>
-      </w:pPr>
-    </w:lvl>
-    <w:lvl w:ilvl="7">
-      <w:start w:val="1"/>
-      <w:numFmt w:val="decimal"/>
-      <w:lvlText w:val="%8."/>
-      <w:lvlJc w:val="left"/>
-      <w:pPr>
-        <w:ind w:left="5760" w:hanging="360"/>
-      </w:pPr>
-    </w:lvl>
-    <w:lvl w:ilvl="8">
-      <w:start w:val="1"/>
-      <w:numFmt w:val="decimal"/>
-      <w:lvlText w:val="%9."/>
-      <w:lvlJc w:val="left"/>
-      <w:pPr>
-        <w:ind w:left="6480" w:hanging="360"/>
-      </w:pPr>
-    </w:lvl>
-  </w:abstractNum>
   <w:num w:numId="1000">
     <w:abstractNumId w:val="990"/>
-  </w:num>
-  <w:num w:numId="1001">
-    <w:abstractNumId w:val="99411"/>
-    <w:lvlOverride w:ilvl="0">
-      <w:startOverride w:val="1"/>
-    </w:lvlOverride>
-    <w:lvlOverride w:ilvl="1">
-      <w:startOverride w:val="1"/>
-    </w:lvlOverride>
-    <w:lvlOverride w:ilvl="2">
-      <w:startOverride w:val="1"/>
-    </w:lvlOverride>
-    <w:lvlOverride w:ilvl="3">
-      <w:startOverride w:val="1"/>
-    </w:lvlOverride>
-    <w:lvlOverride w:ilvl="4">
-      <w:startOverride w:val="1"/>
-    </w:lvlOverride>
-    <w:lvlOverride w:ilvl="5">
-      <w:startOverride w:val="1"/>
-    </w:lvlOverride>
-    <w:lvlOverride w:ilvl="6">
-      <w:startOverride w:val="1"/>
-    </w:lvlOverride>
-    <w:lvlOverride w:ilvl="7">
-      <w:startOverride w:val="1"/>
-    </w:lvlOverride>
-    <w:lvlOverride w:ilvl="8">
-      <w:startOverride w:val="1"/>
-    </w:lvlOverride>
   </w:num>
 </w:numbering>
 </file>

</xml_diff>

<commit_message>
fix: add DOCX-visible blocks for mainreceiver, attachments, signature
- Add content-visible blocks (when-format=docx) for:
  主送机关, 附件列表, 署名/日期/附注, 版记
- These are injected via LaTeX filter for PDF; DOCX needs them
  in the body since gbt9704-metadata.lua only targets LaTeX
- Update rendered outputs

Co-Authored-By: Claude <noreply@anthropic.com>
</commit_message>
<xml_diff>
--- a/example.docx
+++ b/example.docx
@@ -27,6 +27,17 @@
     <w:p>
       <w:pPr>
         <w:pStyle w:val="FirstParagraph"/>
+      </w:pPr>
+      <w:r>
+        <w:rPr>
+          <w:rFonts w:hint="eastAsia"/>
+        </w:rPr>
+        <w:t xml:space="preserve">各有关单位：</w:t>
+      </w:r>
+    </w:p>
+    <w:p>
+      <w:pPr>
+        <w:pStyle w:val="BodyText"/>
       </w:pPr>
       <w:r>
         <w:rPr>
@@ -486,6 +497,102 @@
           <w:rFonts w:hint="eastAsia"/>
         </w:rPr>
         <w:t xml:space="preserve">附件是公文正文的补充说明材料，是公文的重要组成部分。附件应当另页编排，并在版记之前、成文日期之后标注。</w:t>
+      </w:r>
+    </w:p>
+    <w:p>
+      <w:pPr>
+        <w:pStyle w:val="BodyText"/>
+      </w:pPr>
+      <w:r>
+        <w:rPr>
+          <w:rFonts w:hint="eastAsia"/>
+        </w:rPr>
+        <w:t xml:space="preserve">附件：1.</w:t>
+      </w:r>
+      <w:r>
+        <w:t xml:space="preserve"> </w:t>
+      </w:r>
+      <w:r>
+        <w:rPr>
+          <w:rFonts w:hint="eastAsia"/>
+        </w:rPr>
+        <w:t xml:space="preserve">关于印发《公文处理办法》的通知</w:t>
+      </w:r>
+    </w:p>
+    <w:p>
+      <w:pPr>
+        <w:pStyle w:val="BodyText"/>
+      </w:pPr>
+      <w:r>
+        <w:t xml:space="preserve">　　2. </w:t>
+      </w:r>
+      <w:r>
+        <w:rPr>
+          <w:rFonts w:hint="eastAsia"/>
+        </w:rPr>
+        <w:t xml:space="preserve">公文格式标准对照表</w:t>
+      </w:r>
+    </w:p>
+    <w:p>
+      <w:pPr>
+        <w:pStyle w:val="BodyText"/>
+      </w:pPr>
+      <w:r>
+        <w:rPr>
+          <w:rFonts w:hint="eastAsia"/>
+        </w:rPr>
+        <w:t xml:space="preserve">XX单位办公室</w:t>
+      </w:r>
+      <w:r>
+        <w:t xml:space="preserve"> </w:t>
+      </w:r>
+      <w:r>
+        <w:rPr>
+          <w:rFonts w:hint="eastAsia"/>
+        </w:rPr>
+        <w:t xml:space="preserve">202X年X月X日</w:t>
+      </w:r>
+    </w:p>
+    <w:p>
+      <w:pPr>
+        <w:pStyle w:val="BodyText"/>
+      </w:pPr>
+      <w:r>
+        <w:rPr>
+          <w:rFonts w:hint="eastAsia"/>
+        </w:rPr>
+        <w:t xml:space="preserve">（此件公开发布）</w:t>
+      </w:r>
+    </w:p>
+    <w:p>
+      <w:pPr>
+        <w:pStyle w:val="BodyText"/>
+      </w:pPr>
+      <w:r>
+        <w:rPr>
+          <w:rFonts w:hint="eastAsia"/>
+        </w:rPr>
+        <w:t xml:space="preserve">抄送：XX部门、XX委员会</w:t>
+      </w:r>
+    </w:p>
+    <w:p>
+      <w:pPr>
+        <w:pStyle w:val="BodyText"/>
+      </w:pPr>
+      <w:r>
+        <w:rPr>
+          <w:rFonts w:hint="eastAsia"/>
+        </w:rPr>
+        <w:t xml:space="preserve">XX单位办公室</w:t>
+      </w:r>
+      <w:r>
+        <w:t xml:space="preserve">　　</w:t>
+      </w:r>
+      <w:r>
+        <w:rPr>
+          <w:rFonts w:hint="eastAsia"/>
+        </w:rPr>
+        <w:t xml:space="preserve">202X年X月X日</w:t>
       </w:r>
     </w:p>
     <w:sectPr>

</xml_diff>

<commit_message>
feat: extend gbt9704-metadata.lua to support DOCX format
- Add DOCX branch to gbt9704-metadata.lua: inject metadata as
  plain paragraphs instead of LaTeX commands
- Add filter to DOCX chain in _extension.yml
- Remove all :::{.content-visible} blocks from example.qmd
  — YAML metadata now drives all formats uniformly
- Fix DOCX subtitle duplication (Pandoc handles it natively)
- Update rendered outputs

Co-Authored-By: Claude <noreply@anthropic.com>
</commit_message>
<xml_diff>
--- a/example.docx
+++ b/example.docx
@@ -524,7 +524,13 @@
         <w:pStyle w:val="BodyText"/>
       </w:pPr>
       <w:r>
-        <w:t xml:space="preserve">　　2. </w:t>
+        <w:rPr>
+          <w:rFonts w:hint="eastAsia"/>
+        </w:rPr>
+        <w:t xml:space="preserve">附件：2.</w:t>
+      </w:r>
+      <w:r>
+        <w:t xml:space="preserve"> </w:t>
       </w:r>
       <w:r>
         <w:rPr>
@@ -543,9 +549,11 @@
         </w:rPr>
         <w:t xml:space="preserve">XX单位办公室</w:t>
       </w:r>
-      <w:r>
-        <w:t xml:space="preserve"> </w:t>
-      </w:r>
+    </w:p>
+    <w:p>
+      <w:pPr>
+        <w:pStyle w:val="BodyText"/>
+      </w:pPr>
       <w:r>
         <w:rPr>
           <w:rFonts w:hint="eastAsia"/>
@@ -586,7 +594,7 @@
         <w:t xml:space="preserve">XX单位办公室</w:t>
       </w:r>
       <w:r>
-        <w:t xml:space="preserve">　　</w:t>
+        <w:t xml:space="preserve">  </w:t>
       </w:r>
       <w:r>
         <w:rPr>

</xml_diff>

<commit_message>
fix: DOCX mainreceiver no-indent (Normal style), attachments use full-width spaces
- Main receiver: raw OpenXML with Normal style (no first-line indent)
- Multi-attachments: first item '附件：xxx', rest '　　　xxx'
  (3 full-width spaces, matching gbt9704.cls attachment layout)
- Update rendered outputs

Co-Authored-By: Claude <noreply@anthropic.com>
</commit_message>
<xml_diff>
--- a/example.docx
+++ b/example.docx
@@ -26,18 +26,15 @@
     </w:p>
     <w:p>
       <w:pPr>
+        <w:pStyle w:val="Normal"/>
+      </w:pPr>
+      <w:r>
+        <w:t xml:space="preserve">各有关单位：</w:t>
+      </w:r>
+    </w:p>
+    <w:p>
+      <w:pPr>
         <w:pStyle w:val="FirstParagraph"/>
-      </w:pPr>
-      <w:r>
-        <w:rPr>
-          <w:rFonts w:hint="eastAsia"/>
-        </w:rPr>
-        <w:t xml:space="preserve">各有关单位：</w:t>
-      </w:r>
-    </w:p>
-    <w:p>
-      <w:pPr>
-        <w:pStyle w:val="BodyText"/>
       </w:pPr>
       <w:r>
         <w:rPr>
@@ -524,13 +521,7 @@
         <w:pStyle w:val="BodyText"/>
       </w:pPr>
       <w:r>
-        <w:rPr>
-          <w:rFonts w:hint="eastAsia"/>
-        </w:rPr>
-        <w:t xml:space="preserve">附件：2.</w:t>
-      </w:r>
-      <w:r>
-        <w:t xml:space="preserve"> </w:t>
+        <w:t xml:space="preserve">　　　2. </w:t>
       </w:r>
       <w:r>
         <w:rPr>

</xml_diff>

<commit_message>
fix: DOCX alignment matches LaTeX layout (flushright, no-indent)
- Mainreceiver: explicit firstLine=0, no indent
- Signature/signdate: right-aligned (jc=right) matching \signature/\signdate
- Notes: left-aligned no-indent, parentheses added
- Copyto: left-aligned no-indent matching \copyto
- Issue-info: left+right tab stop matching \issueinfo's \hfill

Co-Authored-By: Claude <noreply@anthropic.com>
</commit_message>
<xml_diff>
--- a/example.docx
+++ b/example.docx
@@ -26,9 +26,12 @@
     </w:p>
     <w:p>
       <w:pPr>
-        <w:pStyle w:val="Normal"/>
-      </w:pPr>
-      <w:r>
+        <w:ind w:firstLine="0" w:firstLineChars="0"/>
+      </w:pPr>
+      <w:r>
+        <w:rPr>
+          <w:rFonts w:ascii="仿宋_GB2312" w:hAnsi="仿宋_GB2312" w:eastAsia="仿宋_GB2312"/>
+        </w:rPr>
         <w:t xml:space="preserve">各有关单位：</w:t>
       </w:r>
     </w:p>
@@ -532,65 +535,52 @@
     </w:p>
     <w:p>
       <w:pPr>
-        <w:pStyle w:val="BodyText"/>
-      </w:pPr>
-      <w:r>
-        <w:rPr>
-          <w:rFonts w:hint="eastAsia"/>
-        </w:rPr>
+        <w:jc w:val="right"/>
+        <w:ind w:firstLine="0"/>
+      </w:pPr>
+      <w:r>
         <w:t xml:space="preserve">XX单位办公室</w:t>
       </w:r>
     </w:p>
     <w:p>
       <w:pPr>
-        <w:pStyle w:val="BodyText"/>
-      </w:pPr>
-      <w:r>
-        <w:rPr>
-          <w:rFonts w:hint="eastAsia"/>
-        </w:rPr>
+        <w:jc w:val="right"/>
+        <w:ind w:firstLine="0"/>
+      </w:pPr>
+      <w:r>
         <w:t xml:space="preserve">202X年X月X日</w:t>
       </w:r>
     </w:p>
     <w:p>
       <w:pPr>
-        <w:pStyle w:val="BodyText"/>
-      </w:pPr>
-      <w:r>
-        <w:rPr>
-          <w:rFonts w:hint="eastAsia"/>
-        </w:rPr>
+        <w:ind w:firstLine="0"/>
+      </w:pPr>
+      <w:r>
         <w:t xml:space="preserve">（此件公开发布）</w:t>
       </w:r>
     </w:p>
     <w:p>
       <w:pPr>
-        <w:pStyle w:val="BodyText"/>
-      </w:pPr>
-      <w:r>
-        <w:rPr>
-          <w:rFonts w:hint="eastAsia"/>
-        </w:rPr>
+        <w:ind w:firstLine="0"/>
+      </w:pPr>
+      <w:r>
         <w:t xml:space="preserve">抄送：XX部门、XX委员会</w:t>
       </w:r>
     </w:p>
     <w:p>
       <w:pPr>
-        <w:pStyle w:val="BodyText"/>
-      </w:pPr>
-      <w:r>
-        <w:rPr>
-          <w:rFonts w:hint="eastAsia"/>
-        </w:rPr>
+        <w:ind w:firstLine="0"/>
+        <w:tabs>
+          <w:tab w:val="right" w:pos="9072"/>
+        </w:tabs>
+      </w:pPr>
+      <w:r>
         <w:t xml:space="preserve">XX单位办公室</w:t>
       </w:r>
       <w:r>
-        <w:t xml:space="preserve">  </w:t>
-      </w:r>
-      <w:r>
-        <w:rPr>
-          <w:rFonts w:hint="eastAsia"/>
-        </w:rPr>
+        <w:tab/>
+      </w:r>
+      <w:r>
         <w:t xml:space="preserve">202X年X月X日</w:t>
       </w:r>
     </w:p>

</xml_diff>

<commit_message>
feat: add red header to DOCX, redline to all formats
- DOCX: red header (centered + red + 22pt) + HorizontalRule separator
- ConTeXt: \redseparator (already present)
- LaTeX: \makeheader with \if@gbt@redline (already present)
- Refactor: extract has_redline check once for all formats

Co-Authored-By: Claude <noreply@anthropic.com>
</commit_message>
<xml_diff>
--- a/example.docx
+++ b/example.docx
@@ -22,6 +22,47 @@
           <w:rFonts w:hint="eastAsia"/>
         </w:rPr>
         <w:t xml:space="preserve">——关于做好公文格式标准化工作的通知</w:t>
+      </w:r>
+    </w:p>
+    <w:p>
+      <w:pPr>
+        <w:jc w:val="center"/>
+        <w:ind w:firstLine="0"/>
+      </w:pPr>
+      <w:r>
+        <w:rPr>
+          <w:rFonts w:eastAsia="方正小标宋简体"/>
+          <w:sz w:val="44"/>
+          <w:color w:val="C8102E"/>
+          <w:b/>
+        </w:rPr>
+        <w:t xml:space="preserve">XX单位办公室</w:t>
+      </w:r>
+    </w:p>
+    <w:p>
+      <w:pPr>
+        <w:jc w:val="center"/>
+        <w:ind w:firstLine="0"/>
+      </w:pPr>
+      <w:r>
+        <w:rPr>
+          <w:rFonts w:eastAsia="宋体"/>
+          <w:sz w:val="28"/>
+        </w:rPr>
+        <w:t xml:space="preserve">XX发〔202X〕X号</w:t>
+      </w:r>
+    </w:p>
+    <w:p>
+      <w:pPr>
+        <w:jc w:val="center"/>
+        <w:ind w:firstLine="0"/>
+      </w:pPr>
+      <w:r>
+        <w:rPr>
+          <w:rFonts w:eastAsia="宋体"/>
+          <w:sz w:val="28"/>
+        </w:rPr>
+        <w:t xml:space="preserve">张三</w:t>
       </w:r>
     </w:p>
     <w:p>

</xml_diff>

<commit_message>
fix: docx title order, context/docx right-indent, remove redline from non-PDF
- DOCX: suppress default title, inject in correct order (header→title→subtitle)
- ConTeXt/DOCX: signature/date right-indent 2em
- LaTeX cls: \signature/\signdate add \hspace{2\ccwd}
- Simplify: remove redline from ConTeXt/DOCX (LaTeX-only via classoption)
- Update rendered outputs

Co-Authored-By: Claude <noreply@anthropic.com>
</commit_message>
<xml_diff>
--- a/example.docx
+++ b/example.docx
@@ -4,28 +4,6 @@
   <w:body>
     <w:p>
       <w:pPr>
-        <w:pStyle w:val="Title"/>
-      </w:pPr>
-      <w:r>
-        <w:rPr>
-          <w:rFonts w:hint="eastAsia"/>
-        </w:rPr>
-        <w:t xml:space="preserve">关于印发《公文格式示例》的通知</w:t>
-      </w:r>
-    </w:p>
-    <w:p>
-      <w:pPr>
-        <w:pStyle w:val="Subtitle"/>
-      </w:pPr>
-      <w:r>
-        <w:rPr>
-          <w:rFonts w:hint="eastAsia"/>
-        </w:rPr>
-        <w:t xml:space="preserve">——关于做好公文格式标准化工作的通知</w:t>
-      </w:r>
-    </w:p>
-    <w:p>
-      <w:pPr>
         <w:jc w:val="center"/>
         <w:ind w:firstLine="0"/>
       </w:pPr>
@@ -63,6 +41,33 @@
           <w:sz w:val="28"/>
         </w:rPr>
         <w:t xml:space="preserve">张三</w:t>
+      </w:r>
+    </w:p>
+    <w:p>
+      <w:pPr>
+        <w:jc w:val="center"/>
+        <w:ind w:firstLine="0"/>
+      </w:pPr>
+      <w:r>
+        <w:rPr>
+          <w:rFonts w:eastAsia="方正小标宋简体"/>
+          <w:sz w:val="44"/>
+          <w:b/>
+        </w:rPr>
+        <w:t xml:space="preserve">关于印发《公文格式示例》的通知</w:t>
+      </w:r>
+    </w:p>
+    <w:p>
+      <w:pPr>
+        <w:jc w:val="center"/>
+        <w:ind w:firstLine="0"/>
+      </w:pPr>
+      <w:r>
+        <w:rPr>
+          <w:rFonts w:eastAsia="仿宋_GB2312"/>
+          <w:sz w:val="32"/>
+        </w:rPr>
+        <w:t xml:space="preserve">——关于做好公文格式标准化工作的通知</w:t>
       </w:r>
     </w:p>
     <w:p>

</xml_diff>

<commit_message>
fix: body font FangSong for ConTeXt, add redline for DOCX/ConTeXt
- Change gbtfontpreset: modern->reference (FangSong body font)
- ConTeXt: fix redseparator (\blackrule), no-indent redline
- ConTeXt: fix sig/date right-align (\hfill + \hskip2em)
- DOCX: add redline via red-background paragraph
- Redline controlled by format-level metadata.redline: true
- Update rendered outputs

Co-Authored-By: Claude <noreply@anthropic.com>
</commit_message>
<xml_diff>
--- a/example.docx
+++ b/example.docx
@@ -41,6 +41,18 @@
           <w:sz w:val="28"/>
         </w:rPr>
         <w:t xml:space="preserve">张三</w:t>
+      </w:r>
+    </w:p>
+    <w:p>
+      <w:pPr>
+        <w:ind w:firstLine="0"/>
+        <w:shd w:val="clear" w:color="auto" w:fill="C8102E"/>
+      </w:pPr>
+      <w:r>
+        <w:rPr>
+          <w:sz w:val="4"/>
+        </w:rPr>
+        <w:t xml:space="preserve"> </w:t>
       </w:r>
     </w:p>
     <w:p>

</xml_diff>

<commit_message>
fix: ConTeXt attachment indent, DOCX redline as underline
- ConTeXt: raw \noindent\hskip2em/5em for attachments
  (matching LaTeX \attachmentHZ/\attachmentNOHZ layout)
- DOCX: redline as red underlined spaces (single underline,
  continuous line effect, Pandoc strips w:pBdr)

Co-Authored-By: Claude <noreply@anthropic.com>
</commit_message>
<xml_diff>
--- a/example.docx
+++ b/example.docx
@@ -46,13 +46,13 @@
     <w:p>
       <w:pPr>
         <w:ind w:firstLine="0"/>
-        <w:shd w:val="clear" w:color="auto" w:fill="C8102E"/>
-      </w:pPr>
-      <w:r>
-        <w:rPr>
-          <w:sz w:val="4"/>
-        </w:rPr>
-        <w:t xml:space="preserve"> </w:t>
+      </w:pPr>
+      <w:r>
+        <w:rPr>
+          <w:color w:val="C8102E"/>
+          <w:u w:val="single"/>
+        </w:rPr>
+        <w:t xml:space="preserve">                                                                                            </w:t>
       </w:r>
     </w:p>
     <w:p>

</xml_diff>

<commit_message>
fix: DOCX redline via table border, H1/H2 no bold
- DOCX: redline as single-cell table with red bottom border
  (Pandoc preserves table borders, unlike paragraph borders)
- ConTeXt: H1 \SimHei (no bold), H2 \GBKai (no bold)
- LaTeX cls: remove \bfseries from H2 subsection
- ConTeXt: remove per-font bold variants, use plain font commands

Co-Authored-By: Claude <noreply@anthropic.com>
</commit_message>
<xml_diff>
--- a/example.docx
+++ b/example.docx
@@ -43,18 +43,29 @@
         <w:t xml:space="preserve">张三</w:t>
       </w:r>
     </w:p>
-    <w:p>
-      <w:pPr>
-        <w:ind w:firstLine="0"/>
-      </w:pPr>
-      <w:r>
-        <w:rPr>
-          <w:color w:val="C8102E"/>
-          <w:u w:val="single"/>
-        </w:rPr>
-        <w:t xml:space="preserve">                                                                                            </w:t>
-      </w:r>
-    </w:p>
+    <w:tbl>
+      <w:tblPr>
+        <w:tblBorders>
+          <w:bottom w:val="single" w:sz="6" w:space="0" w:color="C8102E"/>
+        </w:tblBorders>
+        <w:tblW w:w="5000" w:type="pct"/>
+      </w:tblPr>
+      <w:tblGrid>
+        <w:gridCol w:w="9072"/>
+      </w:tblGrid>
+      <w:tr>
+        <w:tc>
+          <w:tcPr>
+            <w:tcW w:w="9072" w:type="dxa"/>
+          </w:tcPr>
+          <w:p>
+            <w:r>
+              <w:t xml:space="preserve"> </w:t>
+            </w:r>
+          </w:p>
+        </w:tc>
+      </w:tr>
+    </w:tbl>
     <w:p>
       <w:pPr>
         <w:jc w:val="center"/>

</xml_diff>

<commit_message>
fix: unify redline thickness to 1.5pt across all formats
- DOCX: w:sz=12 (1.5pt), minimize row height (sz=2, spacing=20)
- ConTeXt: height=1.5pt (matches LaTeX \rule{1.5pt})
- All three formats now use 1.5pt redline thickness

Co-Authored-By: Claude <noreply@anthropic.com>
</commit_message>
<xml_diff>
--- a/example.docx
+++ b/example.docx
@@ -46,7 +46,7 @@
     <w:tbl>
       <w:tblPr>
         <w:tblBorders>
-          <w:bottom w:val="single" w:sz="6" w:space="0" w:color="C8102E"/>
+          <w:bottom w:val="single" w:sz="12" w:space="0" w:color="C8102E"/>
         </w:tblBorders>
         <w:tblW w:w="5000" w:type="pct"/>
       </w:tblPr>
@@ -59,7 +59,13 @@
             <w:tcW w:w="9072" w:type="dxa"/>
           </w:tcPr>
           <w:p>
+            <w:pPr>
+              <w:spacing w:before="0" w:after="0" w:line="20" w:lineRule="atLeast"/>
+            </w:pPr>
             <w:r>
+              <w:rPr>
+                <w:sz w:val="2"/>
+              </w:rPr>
               <w:t xml:space="preserve"> </w:t>
             </w:r>
           </w:p>

</xml_diff>